<commit_message>
Add submission detail placeholders
</commit_message>
<xml_diff>
--- a/deliverables/MietCheck_Handout.docx
+++ b/deliverables/MietCheck_Handout.docx
@@ -514,7 +514,9 @@
           <w:color w:val="65728A"/>
           <w:sz w:val="17"/>
         </w:rPr>
-        <w:t>Nele Knaak  ·  Ersatzleistung Big Data &amp; Data Analytics  ·  Stand 17.07.2026</w:t>
+        <w:t>Nele Knaak  ·  Matrikelnummer: [EINTRAGEN]</w:t>
+        <w:br/>
+        <w:t>Ersatzleistung Big Data &amp; Data Analytics  ·  Prüfer/in: [EINTRAGEN]  ·  Abgabe: [TT.MM.JJJJ]</w:t>
       </w:r>
     </w:p>
     <w:p>

</xml_diff>

<commit_message>
Finalize professor requirements and handout
</commit_message>
<xml_diff>
--- a/deliverables/MietCheck_Handout.docx
+++ b/deliverables/MietCheck_Handout.docx
@@ -310,6 +310,8 @@
                 <w:sz w:val="34"/>
               </w:rPr>
               <w:t>2,06 Mio.</w:t>
+              <w:br/>
+              <w:t>Modellzeilen</w:t>
             </w:r>
           </w:p>
           <w:p>
@@ -322,7 +324,6 @@
                 <w:color w:val="14243A"/>
                 <w:sz w:val="17"/>
               </w:rPr>
-              <w:t>Modellzeilen</w:t>
             </w:r>
           </w:p>
         </w:tc>
@@ -350,6 +351,8 @@
                 <w:sz w:val="34"/>
               </w:rPr>
               <w:t>1,18 Mio.</w:t>
+              <w:br/>
+              <w:t>100-m-Zellen</w:t>
             </w:r>
           </w:p>
           <w:p>
@@ -362,7 +365,6 @@
                 <w:color w:val="14243A"/>
                 <w:sz w:val="17"/>
               </w:rPr>
-              <w:t>100-m-Zellen</w:t>
             </w:r>
           </w:p>
         </w:tc>
@@ -390,6 +392,8 @@
                 <w:sz w:val="34"/>
               </w:rPr>
               <w:t>37 + DE</w:t>
+              <w:br/>
+              <w:t>GREIX-Profile</w:t>
             </w:r>
           </w:p>
           <w:p>
@@ -402,7 +406,6 @@
                 <w:color w:val="14243A"/>
                 <w:sz w:val="17"/>
               </w:rPr>
-              <w:t>GREIX-Profile</w:t>
             </w:r>
           </w:p>
         </w:tc>
@@ -429,7 +432,9 @@
                 <w:color w:val="14243A"/>
                 <w:sz w:val="34"/>
               </w:rPr>
-              <w:t>29</w:t>
+              <w:t>35</w:t>
+              <w:br/>
+              <w:t>automatisierte Tests</w:t>
             </w:r>
           </w:p>
           <w:p>
@@ -442,7 +447,6 @@
                 <w:color w:val="14243A"/>
                 <w:sz w:val="17"/>
               </w:rPr>
-              <w:t>automatisierte Tests</w:t>
             </w:r>
           </w:p>
         </w:tc>
@@ -963,7 +967,7 @@
         <w:rPr>
           <w:color w:val="14243A"/>
         </w:rPr>
-        <w:t>Datenverträge prüfen Spalten, Typen, Schlüssel, Kategorien und zulässige Wertebereiche.</w:t>
+        <w:t>Datenverträge prüfen Spalten, Typen, Schlüssel, Kategorien, Missingness und Join-Verluste.</w:t>
       </w:r>
     </w:p>
     <w:p>
@@ -977,7 +981,7 @@
         <w:rPr>
           <w:color w:val="14243A"/>
         </w:rPr>
-        <w:t>Missingness und Join-Verluste werden als Berichte versioniert, nicht still imputiert.</w:t>
+        <w:t>Ridge, LinearSVR und MLP erhalten Imputer und StandardScaler ausschließlich im Trainingsfold; Baumverfahren bleiben unskaliert.</w:t>
       </w:r>
     </w:p>
     <w:p>
@@ -1782,7 +1786,7 @@
         <w:rPr>
           <w:color w:val="14243A"/>
         </w:rPr>
-        <w:t>Fünf Modellfamilien unter identischer Spatial CV</w:t>
+        <w:t>Sieben Modellfamilien unter identischer Spatial CV</w:t>
       </w:r>
     </w:p>
     <w:tbl>
@@ -2128,7 +2132,7 @@
               <w:rPr>
                 <w:sz w:val="16"/>
               </w:rPr>
-              <w:t>MLP</w:t>
+              <w:t>Decision Tree</w:t>
             </w:r>
           </w:p>
         </w:tc>
@@ -2150,7 +2154,7 @@
               <w:rPr>
                 <w:sz w:val="16"/>
               </w:rPr>
-              <w:t>1,397 €/m²</w:t>
+              <w:t>1,393 €/m²</w:t>
             </w:r>
           </w:p>
         </w:tc>
@@ -2220,7 +2224,7 @@
               <w:rPr>
                 <w:sz w:val="16"/>
               </w:rPr>
-              <w:t>Ridge</w:t>
+              <w:t>MLP</w:t>
             </w:r>
           </w:p>
         </w:tc>
@@ -2243,7 +2247,7 @@
               <w:rPr>
                 <w:sz w:val="16"/>
               </w:rPr>
-              <w:t>1,632 €/m²</w:t>
+              <w:t>1,397 €/m²</w:t>
             </w:r>
           </w:p>
         </w:tc>
@@ -2291,6 +2295,186 @@
                 <w:sz w:val="16"/>
               </w:rPr>
               <w:t>5</w:t>
+            </w:r>
+          </w:p>
+        </w:tc>
+        <w:tc>
+          <w:tcPr>
+            <w:tcW w:type="dxa" w:w="3118"/>
+            <w:tcMar>
+              <w:top w:w="90" w:type="dxa"/>
+              <w:start w:w="110" w:type="dxa"/>
+              <w:bottom w:w="90" w:type="dxa"/>
+              <w:end w:w="110" w:type="dxa"/>
+            </w:tcMar>
+          </w:tcPr>
+          <w:p>
+            <w:pPr>
+              <w:spacing w:after="0"/>
+            </w:pPr>
+            <w:r>
+              <w:rPr>
+                <w:sz w:val="16"/>
+              </w:rPr>
+              <w:t>Ridge</w:t>
+            </w:r>
+          </w:p>
+        </w:tc>
+        <w:tc>
+          <w:tcPr>
+            <w:tcW w:type="dxa" w:w="2381"/>
+            <w:tcMar>
+              <w:top w:w="90" w:type="dxa"/>
+              <w:start w:w="110" w:type="dxa"/>
+              <w:bottom w:w="90" w:type="dxa"/>
+              <w:end w:w="110" w:type="dxa"/>
+            </w:tcMar>
+          </w:tcPr>
+          <w:p>
+            <w:pPr>
+              <w:spacing w:after="0"/>
+            </w:pPr>
+            <w:r>
+              <w:rPr>
+                <w:sz w:val="16"/>
+              </w:rPr>
+              <w:t>1,632 €/m²</w:t>
+            </w:r>
+          </w:p>
+        </w:tc>
+        <w:tc>
+          <w:tcPr>
+            <w:tcW w:type="dxa" w:w="4025"/>
+            <w:tcMar>
+              <w:top w:w="90" w:type="dxa"/>
+              <w:start w:w="110" w:type="dxa"/>
+              <w:bottom w:w="90" w:type="dxa"/>
+              <w:end w:w="110" w:type="dxa"/>
+            </w:tcMar>
+          </w:tcPr>
+          <w:p>
+            <w:pPr>
+              <w:spacing w:after="0"/>
+            </w:pPr>
+            <w:r>
+              <w:rPr>
+                <w:sz w:val="16"/>
+              </w:rPr>
+              <w:t>verworfen</w:t>
+            </w:r>
+          </w:p>
+        </w:tc>
+      </w:tr>
+      <w:tr>
+        <w:tc>
+          <w:tcPr>
+            <w:tcW w:type="dxa" w:w="850"/>
+            <w:tcMar>
+              <w:top w:w="90" w:type="dxa"/>
+              <w:start w:w="110" w:type="dxa"/>
+              <w:bottom w:w="90" w:type="dxa"/>
+              <w:end w:w="110" w:type="dxa"/>
+            </w:tcMar>
+          </w:tcPr>
+          <w:p>
+            <w:pPr>
+              <w:spacing w:after="0"/>
+            </w:pPr>
+            <w:r>
+              <w:rPr>
+                <w:sz w:val="16"/>
+              </w:rPr>
+              <w:t>6</w:t>
+            </w:r>
+          </w:p>
+        </w:tc>
+        <w:tc>
+          <w:tcPr>
+            <w:tcW w:type="dxa" w:w="3118"/>
+            <w:tcMar>
+              <w:top w:w="90" w:type="dxa"/>
+              <w:start w:w="110" w:type="dxa"/>
+              <w:bottom w:w="90" w:type="dxa"/>
+              <w:end w:w="110" w:type="dxa"/>
+            </w:tcMar>
+          </w:tcPr>
+          <w:p>
+            <w:pPr>
+              <w:spacing w:after="0"/>
+            </w:pPr>
+            <w:r>
+              <w:rPr>
+                <w:sz w:val="16"/>
+              </w:rPr>
+              <w:t>LinearSVR</w:t>
+            </w:r>
+          </w:p>
+        </w:tc>
+        <w:tc>
+          <w:tcPr>
+            <w:tcW w:type="dxa" w:w="2381"/>
+            <w:tcMar>
+              <w:top w:w="90" w:type="dxa"/>
+              <w:start w:w="110" w:type="dxa"/>
+              <w:bottom w:w="90" w:type="dxa"/>
+              <w:end w:w="110" w:type="dxa"/>
+            </w:tcMar>
+          </w:tcPr>
+          <w:p>
+            <w:pPr>
+              <w:spacing w:after="0"/>
+            </w:pPr>
+            <w:r>
+              <w:rPr>
+                <w:sz w:val="16"/>
+              </w:rPr>
+              <w:t>1,635 €/m²</w:t>
+            </w:r>
+          </w:p>
+        </w:tc>
+        <w:tc>
+          <w:tcPr>
+            <w:tcW w:type="dxa" w:w="4025"/>
+            <w:tcMar>
+              <w:top w:w="90" w:type="dxa"/>
+              <w:start w:w="110" w:type="dxa"/>
+              <w:bottom w:w="90" w:type="dxa"/>
+              <w:end w:w="110" w:type="dxa"/>
+            </w:tcMar>
+          </w:tcPr>
+          <w:p>
+            <w:pPr>
+              <w:spacing w:after="0"/>
+            </w:pPr>
+            <w:r>
+              <w:rPr>
+                <w:sz w:val="16"/>
+              </w:rPr>
+              <w:t>verworfen</w:t>
+            </w:r>
+          </w:p>
+        </w:tc>
+      </w:tr>
+      <w:tr>
+        <w:tc>
+          <w:tcPr>
+            <w:tcW w:type="dxa" w:w="850"/>
+            <w:tcMar>
+              <w:top w:w="90" w:type="dxa"/>
+              <w:start w:w="110" w:type="dxa"/>
+              <w:bottom w:w="90" w:type="dxa"/>
+              <w:end w:w="110" w:type="dxa"/>
+            </w:tcMar>
+          </w:tcPr>
+          <w:p>
+            <w:pPr>
+              <w:spacing w:after="0"/>
+            </w:pPr>
+            <w:r>
+              <w:rPr>
+                <w:sz w:val="16"/>
+              </w:rPr>
+              <w:t>7</w:t>
             </w:r>
           </w:p>
         </w:tc>
@@ -2632,7 +2816,7 @@
         <w:keepLines/>
       </w:pPr>
       <w:r>
-        <w:t>learning_rate 0,06 · 300 Iterationen · 127 Blätter · mindestens 100 Zeilen je Blatt · L2-Regularisierung 5</w:t>
+        <w:t>learning_rate 0,06 · 300 Iterationen · 127 Blätter · mindestens 100 Zeilen je Blatt · L2-Regularisierung 5. Ergänzend schlägt RBF-SVR LinearSVR auf einer transparenten 10k-Machbarkeitsstichprobe, wird wegen der Skalierungskosten aber nicht auf 600.000 Zeilen trainiert.</w:t>
       </w:r>
     </w:p>
     <w:p>
@@ -3305,7 +3489,7 @@
               <w:rPr>
                 <w:sz w:val="16"/>
               </w:rPr>
-              <w:t>Q · Qualität</w:t>
+              <w:t>Q · Question</w:t>
             </w:r>
           </w:p>
         </w:tc>
@@ -3327,7 +3511,7 @@
               <w:rPr>
                 <w:sz w:val="16"/>
               </w:rPr>
-              <w:t>Hashes, Grain, Missingness, Datenverträge</w:t>
+              <w:t>Leitfrage, Zielgruppe, USP und Erfolgsgates</w:t>
             </w:r>
           </w:p>
         </w:tc>
@@ -3375,7 +3559,7 @@
               <w:rPr>
                 <w:sz w:val="16"/>
               </w:rPr>
-              <w:t>EDA, Zielverteilung, räumliche Struktur</w:t>
+              <w:t>Datenherkunft, EDA, Datenqualität und StandardScaler</w:t>
             </w:r>
           </w:p>
         </w:tc>
@@ -3421,7 +3605,7 @@
               <w:rPr>
                 <w:sz w:val="16"/>
               </w:rPr>
-              <w:t>5 Modelle unter identischer Spatial CV</w:t>
+              <w:t>7 Kandidaten unter Spatial CV plus Linear- vs. RBF-SVR</w:t>
             </w:r>
           </w:p>
         </w:tc>
@@ -3469,7 +3653,7 @@
               <w:rPr>
                 <w:sz w:val="16"/>
               </w:rPr>
-              <w:t>8 Tunings, 4 Feature-Ablationen</w:t>
+              <w:t>4 Feature-Ablationen</w:t>
             </w:r>
           </w:p>
         </w:tc>
@@ -3515,7 +3699,7 @@
               <w:rPr>
                 <w:sz w:val="16"/>
               </w:rPr>
-              <w:t>finales Artefakt, getrennte Kalibrierung</w:t>
+              <w:t>8 HGB-Tunings und finales Artefakt</w:t>
             </w:r>
           </w:p>
         </w:tc>
@@ -3563,7 +3747,7 @@
               <w:rPr>
                 <w:sz w:val="16"/>
               </w:rPr>
-              <w:t>finaler Holdout, Baseline und Subgruppen</w:t>
+              <w:t>finaler Holdout, Unsicherheit und Subgruppen</w:t>
             </w:r>
           </w:p>
         </w:tc>
@@ -3609,7 +3793,7 @@
               <w:rPr>
                 <w:sz w:val="16"/>
               </w:rPr>
-              <w:t>Streamlit-App, USP und Umzugsaufschlag</w:t>
+              <w:t>Streamlit-App, USP und Grenzen</w:t>
             </w:r>
           </w:p>
         </w:tc>
@@ -3647,7 +3831,7 @@
                 <w:color w:val="2F5BFF"/>
                 <w:sz w:val="22"/>
               </w:rPr>
-              <w:t>7/7 ausgeführte Notebooks · 33/33 Codezellen · 0 Fehleroutputs · automatisierter Ausführungsbericht</w:t>
+              <w:t>4/4 Rechennotebooks ausgeführt · 24/24 Codezellen · 0 Fehleroutputs · K-Phase als Transfer-Artefakt · automatisierter Ausführungsbericht</w:t>
             </w:r>
           </w:p>
         </w:tc>
@@ -3776,7 +3960,7 @@
               <w:rPr>
                 <w:sz w:val="16"/>
               </w:rPr>
-              <w:t>pip install -r requirements.txt</w:t>
+              <w:t>pip install -r requirements-dev.txt</w:t>
             </w:r>
           </w:p>
         </w:tc>
@@ -3798,7 +3982,7 @@
               <w:rPr>
                 <w:sz w:val="16"/>
               </w:rPr>
-              <w:t>Laufzeit installieren</w:t>
+              <w:t>Laufzeit, Entwicklung und Tests installieren</w:t>
             </w:r>
           </w:p>
         </w:tc>
@@ -3892,7 +4076,7 @@
               <w:rPr>
                 <w:sz w:val="16"/>
               </w:rPr>
-              <w:t>29 Tests ausführen</w:t>
+              <w:t>35 Tests ausführen</w:t>
             </w:r>
           </w:p>
         </w:tc>

</xml_diff>

<commit_message>
Finalize professor requirements and handout (#6)
</commit_message>
<xml_diff>
--- a/deliverables/MietCheck_Handout.docx
+++ b/deliverables/MietCheck_Handout.docx
@@ -310,6 +310,8 @@
                 <w:sz w:val="34"/>
               </w:rPr>
               <w:t>2,06 Mio.</w:t>
+              <w:br/>
+              <w:t>Modellzeilen</w:t>
             </w:r>
           </w:p>
           <w:p>
@@ -322,7 +324,6 @@
                 <w:color w:val="14243A"/>
                 <w:sz w:val="17"/>
               </w:rPr>
-              <w:t>Modellzeilen</w:t>
             </w:r>
           </w:p>
         </w:tc>
@@ -350,6 +351,8 @@
                 <w:sz w:val="34"/>
               </w:rPr>
               <w:t>1,18 Mio.</w:t>
+              <w:br/>
+              <w:t>100-m-Zellen</w:t>
             </w:r>
           </w:p>
           <w:p>
@@ -362,7 +365,6 @@
                 <w:color w:val="14243A"/>
                 <w:sz w:val="17"/>
               </w:rPr>
-              <w:t>100-m-Zellen</w:t>
             </w:r>
           </w:p>
         </w:tc>
@@ -390,6 +392,8 @@
                 <w:sz w:val="34"/>
               </w:rPr>
               <w:t>37 + DE</w:t>
+              <w:br/>
+              <w:t>GREIX-Profile</w:t>
             </w:r>
           </w:p>
           <w:p>
@@ -402,7 +406,6 @@
                 <w:color w:val="14243A"/>
                 <w:sz w:val="17"/>
               </w:rPr>
-              <w:t>GREIX-Profile</w:t>
             </w:r>
           </w:p>
         </w:tc>
@@ -429,7 +432,9 @@
                 <w:color w:val="14243A"/>
                 <w:sz w:val="34"/>
               </w:rPr>
-              <w:t>29</w:t>
+              <w:t>35</w:t>
+              <w:br/>
+              <w:t>automatisierte Tests</w:t>
             </w:r>
           </w:p>
           <w:p>
@@ -442,7 +447,6 @@
                 <w:color w:val="14243A"/>
                 <w:sz w:val="17"/>
               </w:rPr>
-              <w:t>automatisierte Tests</w:t>
             </w:r>
           </w:p>
         </w:tc>
@@ -963,7 +967,7 @@
         <w:rPr>
           <w:color w:val="14243A"/>
         </w:rPr>
-        <w:t>Datenverträge prüfen Spalten, Typen, Schlüssel, Kategorien und zulässige Wertebereiche.</w:t>
+        <w:t>Datenverträge prüfen Spalten, Typen, Schlüssel, Kategorien, Missingness und Join-Verluste.</w:t>
       </w:r>
     </w:p>
     <w:p>
@@ -977,7 +981,7 @@
         <w:rPr>
           <w:color w:val="14243A"/>
         </w:rPr>
-        <w:t>Missingness und Join-Verluste werden als Berichte versioniert, nicht still imputiert.</w:t>
+        <w:t>Ridge, LinearSVR und MLP erhalten Imputer und StandardScaler ausschließlich im Trainingsfold; Baumverfahren bleiben unskaliert.</w:t>
       </w:r>
     </w:p>
     <w:p>
@@ -1782,7 +1786,7 @@
         <w:rPr>
           <w:color w:val="14243A"/>
         </w:rPr>
-        <w:t>Fünf Modellfamilien unter identischer Spatial CV</w:t>
+        <w:t>Sieben Modellfamilien unter identischer Spatial CV</w:t>
       </w:r>
     </w:p>
     <w:tbl>
@@ -2128,7 +2132,7 @@
               <w:rPr>
                 <w:sz w:val="16"/>
               </w:rPr>
-              <w:t>MLP</w:t>
+              <w:t>Decision Tree</w:t>
             </w:r>
           </w:p>
         </w:tc>
@@ -2150,7 +2154,7 @@
               <w:rPr>
                 <w:sz w:val="16"/>
               </w:rPr>
-              <w:t>1,397 €/m²</w:t>
+              <w:t>1,393 €/m²</w:t>
             </w:r>
           </w:p>
         </w:tc>
@@ -2220,7 +2224,7 @@
               <w:rPr>
                 <w:sz w:val="16"/>
               </w:rPr>
-              <w:t>Ridge</w:t>
+              <w:t>MLP</w:t>
             </w:r>
           </w:p>
         </w:tc>
@@ -2243,7 +2247,7 @@
               <w:rPr>
                 <w:sz w:val="16"/>
               </w:rPr>
-              <w:t>1,632 €/m²</w:t>
+              <w:t>1,397 €/m²</w:t>
             </w:r>
           </w:p>
         </w:tc>
@@ -2291,6 +2295,186 @@
                 <w:sz w:val="16"/>
               </w:rPr>
               <w:t>5</w:t>
+            </w:r>
+          </w:p>
+        </w:tc>
+        <w:tc>
+          <w:tcPr>
+            <w:tcW w:type="dxa" w:w="3118"/>
+            <w:tcMar>
+              <w:top w:w="90" w:type="dxa"/>
+              <w:start w:w="110" w:type="dxa"/>
+              <w:bottom w:w="90" w:type="dxa"/>
+              <w:end w:w="110" w:type="dxa"/>
+            </w:tcMar>
+          </w:tcPr>
+          <w:p>
+            <w:pPr>
+              <w:spacing w:after="0"/>
+            </w:pPr>
+            <w:r>
+              <w:rPr>
+                <w:sz w:val="16"/>
+              </w:rPr>
+              <w:t>Ridge</w:t>
+            </w:r>
+          </w:p>
+        </w:tc>
+        <w:tc>
+          <w:tcPr>
+            <w:tcW w:type="dxa" w:w="2381"/>
+            <w:tcMar>
+              <w:top w:w="90" w:type="dxa"/>
+              <w:start w:w="110" w:type="dxa"/>
+              <w:bottom w:w="90" w:type="dxa"/>
+              <w:end w:w="110" w:type="dxa"/>
+            </w:tcMar>
+          </w:tcPr>
+          <w:p>
+            <w:pPr>
+              <w:spacing w:after="0"/>
+            </w:pPr>
+            <w:r>
+              <w:rPr>
+                <w:sz w:val="16"/>
+              </w:rPr>
+              <w:t>1,632 €/m²</w:t>
+            </w:r>
+          </w:p>
+        </w:tc>
+        <w:tc>
+          <w:tcPr>
+            <w:tcW w:type="dxa" w:w="4025"/>
+            <w:tcMar>
+              <w:top w:w="90" w:type="dxa"/>
+              <w:start w:w="110" w:type="dxa"/>
+              <w:bottom w:w="90" w:type="dxa"/>
+              <w:end w:w="110" w:type="dxa"/>
+            </w:tcMar>
+          </w:tcPr>
+          <w:p>
+            <w:pPr>
+              <w:spacing w:after="0"/>
+            </w:pPr>
+            <w:r>
+              <w:rPr>
+                <w:sz w:val="16"/>
+              </w:rPr>
+              <w:t>verworfen</w:t>
+            </w:r>
+          </w:p>
+        </w:tc>
+      </w:tr>
+      <w:tr>
+        <w:tc>
+          <w:tcPr>
+            <w:tcW w:type="dxa" w:w="850"/>
+            <w:tcMar>
+              <w:top w:w="90" w:type="dxa"/>
+              <w:start w:w="110" w:type="dxa"/>
+              <w:bottom w:w="90" w:type="dxa"/>
+              <w:end w:w="110" w:type="dxa"/>
+            </w:tcMar>
+          </w:tcPr>
+          <w:p>
+            <w:pPr>
+              <w:spacing w:after="0"/>
+            </w:pPr>
+            <w:r>
+              <w:rPr>
+                <w:sz w:val="16"/>
+              </w:rPr>
+              <w:t>6</w:t>
+            </w:r>
+          </w:p>
+        </w:tc>
+        <w:tc>
+          <w:tcPr>
+            <w:tcW w:type="dxa" w:w="3118"/>
+            <w:tcMar>
+              <w:top w:w="90" w:type="dxa"/>
+              <w:start w:w="110" w:type="dxa"/>
+              <w:bottom w:w="90" w:type="dxa"/>
+              <w:end w:w="110" w:type="dxa"/>
+            </w:tcMar>
+          </w:tcPr>
+          <w:p>
+            <w:pPr>
+              <w:spacing w:after="0"/>
+            </w:pPr>
+            <w:r>
+              <w:rPr>
+                <w:sz w:val="16"/>
+              </w:rPr>
+              <w:t>LinearSVR</w:t>
+            </w:r>
+          </w:p>
+        </w:tc>
+        <w:tc>
+          <w:tcPr>
+            <w:tcW w:type="dxa" w:w="2381"/>
+            <w:tcMar>
+              <w:top w:w="90" w:type="dxa"/>
+              <w:start w:w="110" w:type="dxa"/>
+              <w:bottom w:w="90" w:type="dxa"/>
+              <w:end w:w="110" w:type="dxa"/>
+            </w:tcMar>
+          </w:tcPr>
+          <w:p>
+            <w:pPr>
+              <w:spacing w:after="0"/>
+            </w:pPr>
+            <w:r>
+              <w:rPr>
+                <w:sz w:val="16"/>
+              </w:rPr>
+              <w:t>1,635 €/m²</w:t>
+            </w:r>
+          </w:p>
+        </w:tc>
+        <w:tc>
+          <w:tcPr>
+            <w:tcW w:type="dxa" w:w="4025"/>
+            <w:tcMar>
+              <w:top w:w="90" w:type="dxa"/>
+              <w:start w:w="110" w:type="dxa"/>
+              <w:bottom w:w="90" w:type="dxa"/>
+              <w:end w:w="110" w:type="dxa"/>
+            </w:tcMar>
+          </w:tcPr>
+          <w:p>
+            <w:pPr>
+              <w:spacing w:after="0"/>
+            </w:pPr>
+            <w:r>
+              <w:rPr>
+                <w:sz w:val="16"/>
+              </w:rPr>
+              <w:t>verworfen</w:t>
+            </w:r>
+          </w:p>
+        </w:tc>
+      </w:tr>
+      <w:tr>
+        <w:tc>
+          <w:tcPr>
+            <w:tcW w:type="dxa" w:w="850"/>
+            <w:tcMar>
+              <w:top w:w="90" w:type="dxa"/>
+              <w:start w:w="110" w:type="dxa"/>
+              <w:bottom w:w="90" w:type="dxa"/>
+              <w:end w:w="110" w:type="dxa"/>
+            </w:tcMar>
+          </w:tcPr>
+          <w:p>
+            <w:pPr>
+              <w:spacing w:after="0"/>
+            </w:pPr>
+            <w:r>
+              <w:rPr>
+                <w:sz w:val="16"/>
+              </w:rPr>
+              <w:t>7</w:t>
             </w:r>
           </w:p>
         </w:tc>
@@ -2632,7 +2816,7 @@
         <w:keepLines/>
       </w:pPr>
       <w:r>
-        <w:t>learning_rate 0,06 · 300 Iterationen · 127 Blätter · mindestens 100 Zeilen je Blatt · L2-Regularisierung 5</w:t>
+        <w:t>learning_rate 0,06 · 300 Iterationen · 127 Blätter · mindestens 100 Zeilen je Blatt · L2-Regularisierung 5. Ergänzend schlägt RBF-SVR LinearSVR auf einer transparenten 10k-Machbarkeitsstichprobe, wird wegen der Skalierungskosten aber nicht auf 600.000 Zeilen trainiert.</w:t>
       </w:r>
     </w:p>
     <w:p>
@@ -3305,7 +3489,7 @@
               <w:rPr>
                 <w:sz w:val="16"/>
               </w:rPr>
-              <w:t>Q · Qualität</w:t>
+              <w:t>Q · Question</w:t>
             </w:r>
           </w:p>
         </w:tc>
@@ -3327,7 +3511,7 @@
               <w:rPr>
                 <w:sz w:val="16"/>
               </w:rPr>
-              <w:t>Hashes, Grain, Missingness, Datenverträge</w:t>
+              <w:t>Leitfrage, Zielgruppe, USP und Erfolgsgates</w:t>
             </w:r>
           </w:p>
         </w:tc>
@@ -3375,7 +3559,7 @@
               <w:rPr>
                 <w:sz w:val="16"/>
               </w:rPr>
-              <w:t>EDA, Zielverteilung, räumliche Struktur</w:t>
+              <w:t>Datenherkunft, EDA, Datenqualität und StandardScaler</w:t>
             </w:r>
           </w:p>
         </w:tc>
@@ -3421,7 +3605,7 @@
               <w:rPr>
                 <w:sz w:val="16"/>
               </w:rPr>
-              <w:t>5 Modelle unter identischer Spatial CV</w:t>
+              <w:t>7 Kandidaten unter Spatial CV plus Linear- vs. RBF-SVR</w:t>
             </w:r>
           </w:p>
         </w:tc>
@@ -3469,7 +3653,7 @@
               <w:rPr>
                 <w:sz w:val="16"/>
               </w:rPr>
-              <w:t>8 Tunings, 4 Feature-Ablationen</w:t>
+              <w:t>4 Feature-Ablationen</w:t>
             </w:r>
           </w:p>
         </w:tc>
@@ -3515,7 +3699,7 @@
               <w:rPr>
                 <w:sz w:val="16"/>
               </w:rPr>
-              <w:t>finales Artefakt, getrennte Kalibrierung</w:t>
+              <w:t>8 HGB-Tunings und finales Artefakt</w:t>
             </w:r>
           </w:p>
         </w:tc>
@@ -3563,7 +3747,7 @@
               <w:rPr>
                 <w:sz w:val="16"/>
               </w:rPr>
-              <w:t>finaler Holdout, Baseline und Subgruppen</w:t>
+              <w:t>finaler Holdout, Unsicherheit und Subgruppen</w:t>
             </w:r>
           </w:p>
         </w:tc>
@@ -3609,7 +3793,7 @@
               <w:rPr>
                 <w:sz w:val="16"/>
               </w:rPr>
-              <w:t>Streamlit-App, USP und Umzugsaufschlag</w:t>
+              <w:t>Streamlit-App, USP und Grenzen</w:t>
             </w:r>
           </w:p>
         </w:tc>
@@ -3647,7 +3831,7 @@
                 <w:color w:val="2F5BFF"/>
                 <w:sz w:val="22"/>
               </w:rPr>
-              <w:t>7/7 ausgeführte Notebooks · 33/33 Codezellen · 0 Fehleroutputs · automatisierter Ausführungsbericht</w:t>
+              <w:t>4/4 Rechennotebooks ausgeführt · 24/24 Codezellen · 0 Fehleroutputs · K-Phase als Transfer-Artefakt · automatisierter Ausführungsbericht</w:t>
             </w:r>
           </w:p>
         </w:tc>
@@ -3776,7 +3960,7 @@
               <w:rPr>
                 <w:sz w:val="16"/>
               </w:rPr>
-              <w:t>pip install -r requirements.txt</w:t>
+              <w:t>pip install -r requirements-dev.txt</w:t>
             </w:r>
           </w:p>
         </w:tc>
@@ -3798,7 +3982,7 @@
               <w:rPr>
                 <w:sz w:val="16"/>
               </w:rPr>
-              <w:t>Laufzeit installieren</w:t>
+              <w:t>Laufzeit, Entwicklung und Tests installieren</w:t>
             </w:r>
           </w:p>
         </w:tc>
@@ -3892,7 +4076,7 @@
               <w:rPr>
                 <w:sz w:val="16"/>
               </w:rPr>
-              <w:t>29 Tests ausführen</w:t>
+              <w:t>35 Tests ausführen</w:t>
             </w:r>
           </w:p>
         </w:tc>

</xml_diff>